<commit_message>
just add link to documentation
</commit_message>
<xml_diff>
--- a/FandomVerse_Jungle_Dark_Colors_Documentation (1).docx
+++ b/FandomVerse_Jungle_Dark_Colors_Documentation (1).docx
@@ -8,9 +8,6 @@
         <w:pStyle w:val="JungleTitle"/>
         <w:spacing w:after="80"/>
         <w:jc w:val="center"/>
-        <w:rPr>
-          <w:rFonts w:hint="eastAsia"/>
-        </w:rPr>
       </w:pPr>
       <w:r>
         <w:rPr>
@@ -70,7 +67,6 @@
         <w:spacing w:after="160"/>
         <w:jc w:val="center"/>
         <w:rPr>
-          <w:rFonts w:hint="eastAsia"/>
           <w:color w:val="262626" w:themeColor="text1" w:themeTint="D9"/>
           <w14:shadow w14:blurRad="0" w14:dist="38100" w14:dir="2700000" w14:sx="100000" w14:sy="100000" w14:kx="0" w14:ky="0" w14:algn="bl">
             <w14:schemeClr w14:val="accent5"/>
@@ -105,9 +101,6 @@
       <w:pPr>
         <w:spacing w:after="100"/>
         <w:jc w:val="center"/>
-        <w:rPr>
-          <w:rFonts w:hint="eastAsia"/>
-        </w:rPr>
       </w:pPr>
       <w:r>
         <w:rPr>
@@ -137,9 +130,6 @@
     <w:p>
       <w:pPr>
         <w:jc w:val="center"/>
-        <w:rPr>
-          <w:rFonts w:hint="eastAsia"/>
-        </w:rPr>
       </w:pPr>
       <w:r>
         <w:rPr>
@@ -154,9 +144,6 @@
       <w:pPr>
         <w:pStyle w:val="NoSpacing"/>
         <w:jc w:val="center"/>
-        <w:rPr>
-          <w:rFonts w:hint="eastAsia"/>
-        </w:rPr>
       </w:pPr>
       <w:r>
         <w:t>Anime • Gaming • Movies • TV Shows • K-Pop • Comics • Manga</w:t>
@@ -166,9 +153,6 @@
       <w:pPr>
         <w:spacing w:after="100"/>
         <w:jc w:val="center"/>
-        <w:rPr>
-          <w:rFonts w:hint="eastAsia"/>
-        </w:rPr>
       </w:pPr>
       <w:r>
         <w:rPr>
@@ -206,9 +190,6 @@
           <w:p>
             <w:pPr>
               <w:spacing w:after="0"/>
-              <w:rPr>
-                <w:rFonts w:hint="eastAsia"/>
-              </w:rPr>
             </w:pPr>
             <w:r>
               <w:rPr>
@@ -245,9 +226,6 @@
           <w:p>
             <w:pPr>
               <w:spacing w:after="0"/>
-              <w:rPr>
-                <w:rFonts w:hint="eastAsia"/>
-              </w:rPr>
             </w:pPr>
             <w:r>
               <w:rPr>
@@ -262,9 +240,6 @@
     <w:p>
       <w:pPr>
         <w:spacing w:after="20"/>
-        <w:rPr>
-          <w:rFonts w:hint="eastAsia"/>
-        </w:rPr>
       </w:pPr>
     </w:p>
     <w:p>
@@ -272,9 +247,6 @@
         <w:pStyle w:val="JungleBody"/>
         <w:spacing w:after="60"/>
         <w:ind w:left="259" w:hanging="173"/>
-        <w:rPr>
-          <w:rFonts w:hint="eastAsia"/>
-        </w:rPr>
       </w:pPr>
       <w:r>
         <w:rPr>
@@ -288,9 +260,6 @@
         <w:pStyle w:val="JungleBody"/>
         <w:spacing w:after="60"/>
         <w:ind w:left="259" w:hanging="173"/>
-        <w:rPr>
-          <w:rFonts w:hint="eastAsia"/>
-        </w:rPr>
       </w:pPr>
       <w:r>
         <w:rPr>
@@ -304,9 +273,6 @@
         <w:pStyle w:val="JungleBody"/>
         <w:spacing w:after="60"/>
         <w:ind w:left="259" w:hanging="173"/>
-        <w:rPr>
-          <w:rFonts w:hint="eastAsia"/>
-        </w:rPr>
       </w:pPr>
       <w:r>
         <w:rPr>
@@ -320,9 +286,6 @@
         <w:pStyle w:val="JungleBody"/>
         <w:spacing w:after="60"/>
         <w:ind w:left="259" w:hanging="173"/>
-        <w:rPr>
-          <w:rFonts w:hint="eastAsia"/>
-        </w:rPr>
       </w:pPr>
       <w:r>
         <w:rPr>
@@ -359,9 +322,6 @@
           <w:p>
             <w:pPr>
               <w:spacing w:after="0"/>
-              <w:rPr>
-                <w:rFonts w:hint="eastAsia"/>
-              </w:rPr>
             </w:pPr>
             <w:r>
               <w:rPr>
@@ -398,9 +358,6 @@
           <w:p>
             <w:pPr>
               <w:spacing w:after="0"/>
-              <w:rPr>
-                <w:rFonts w:hint="eastAsia"/>
-              </w:rPr>
             </w:pPr>
             <w:r>
               <w:rPr>
@@ -415,9 +372,6 @@
     <w:p>
       <w:pPr>
         <w:spacing w:after="20"/>
-        <w:rPr>
-          <w:rFonts w:hint="eastAsia"/>
-        </w:rPr>
       </w:pPr>
     </w:p>
     <w:p>
@@ -425,9 +379,6 @@
         <w:pStyle w:val="JungleBody"/>
         <w:spacing w:after="60"/>
         <w:ind w:left="259" w:hanging="173"/>
-        <w:rPr>
-          <w:rFonts w:hint="eastAsia"/>
-        </w:rPr>
       </w:pPr>
       <w:r>
         <w:rPr>
@@ -441,9 +392,6 @@
         <w:pStyle w:val="JungleBody"/>
         <w:spacing w:after="60"/>
         <w:ind w:left="259" w:hanging="173"/>
-        <w:rPr>
-          <w:rFonts w:hint="eastAsia"/>
-        </w:rPr>
       </w:pPr>
       <w:r>
         <w:rPr>
@@ -457,9 +405,6 @@
         <w:pStyle w:val="JungleBody"/>
         <w:spacing w:after="60"/>
         <w:ind w:left="259" w:hanging="173"/>
-        <w:rPr>
-          <w:rFonts w:hint="eastAsia"/>
-        </w:rPr>
       </w:pPr>
       <w:r>
         <w:rPr>
@@ -473,9 +418,6 @@
         <w:pStyle w:val="JungleBody"/>
         <w:spacing w:after="60"/>
         <w:ind w:left="259" w:hanging="173"/>
-        <w:rPr>
-          <w:rFonts w:hint="eastAsia"/>
-        </w:rPr>
       </w:pPr>
       <w:r>
         <w:rPr>
@@ -512,9 +454,6 @@
           <w:p>
             <w:pPr>
               <w:spacing w:after="0"/>
-              <w:rPr>
-                <w:rFonts w:hint="eastAsia"/>
-              </w:rPr>
             </w:pPr>
             <w:r>
               <w:rPr>
@@ -551,9 +490,6 @@
           <w:p>
             <w:pPr>
               <w:spacing w:after="0"/>
-              <w:rPr>
-                <w:rFonts w:hint="eastAsia"/>
-              </w:rPr>
             </w:pPr>
             <w:r>
               <w:rPr>
@@ -568,9 +504,6 @@
     <w:p>
       <w:pPr>
         <w:spacing w:after="20"/>
-        <w:rPr>
-          <w:rFonts w:hint="eastAsia"/>
-        </w:rPr>
       </w:pPr>
     </w:p>
     <w:p>
@@ -578,9 +511,6 @@
         <w:pStyle w:val="JungleBody"/>
         <w:spacing w:after="60"/>
         <w:ind w:left="259" w:hanging="173"/>
-        <w:rPr>
-          <w:rFonts w:hint="eastAsia"/>
-        </w:rPr>
       </w:pPr>
       <w:r>
         <w:rPr>
@@ -594,9 +524,6 @@
         <w:pStyle w:val="JungleBody"/>
         <w:spacing w:after="60"/>
         <w:ind w:left="259" w:hanging="173"/>
-        <w:rPr>
-          <w:rFonts w:hint="eastAsia"/>
-        </w:rPr>
       </w:pPr>
       <w:r>
         <w:rPr>
@@ -610,9 +537,6 @@
         <w:pStyle w:val="JungleBody"/>
         <w:spacing w:after="60"/>
         <w:ind w:left="259" w:hanging="173"/>
-        <w:rPr>
-          <w:rFonts w:hint="eastAsia"/>
-        </w:rPr>
       </w:pPr>
       <w:r>
         <w:rPr>
@@ -626,9 +550,6 @@
         <w:pStyle w:val="JungleBody"/>
         <w:spacing w:after="60"/>
         <w:ind w:left="259" w:hanging="173"/>
-        <w:rPr>
-          <w:rFonts w:hint="eastAsia"/>
-        </w:rPr>
       </w:pPr>
       <w:r>
         <w:rPr>
@@ -642,9 +563,6 @@
         <w:pStyle w:val="JungleBody"/>
         <w:spacing w:after="60"/>
         <w:ind w:left="259" w:hanging="173"/>
-        <w:rPr>
-          <w:rFonts w:hint="eastAsia"/>
-        </w:rPr>
       </w:pPr>
       <w:r>
         <w:rPr>
@@ -681,9 +599,6 @@
           <w:p>
             <w:pPr>
               <w:spacing w:after="0"/>
-              <w:rPr>
-                <w:rFonts w:hint="eastAsia"/>
-              </w:rPr>
             </w:pPr>
             <w:r>
               <w:rPr>
@@ -720,9 +635,6 @@
           <w:p>
             <w:pPr>
               <w:spacing w:after="0"/>
-              <w:rPr>
-                <w:rFonts w:hint="eastAsia"/>
-              </w:rPr>
             </w:pPr>
             <w:r>
               <w:rPr>
@@ -737,9 +649,6 @@
     <w:p>
       <w:pPr>
         <w:spacing w:after="20"/>
-        <w:rPr>
-          <w:rFonts w:hint="eastAsia"/>
-        </w:rPr>
       </w:pPr>
     </w:p>
     <w:tbl>
@@ -771,9 +680,6 @@
           <w:p>
             <w:pPr>
               <w:jc w:val="center"/>
-              <w:rPr>
-                <w:rFonts w:hint="eastAsia"/>
-              </w:rPr>
             </w:pPr>
             <w:r>
               <w:rPr>
@@ -800,9 +706,6 @@
           <w:p>
             <w:pPr>
               <w:jc w:val="center"/>
-              <w:rPr>
-                <w:rFonts w:hint="eastAsia"/>
-              </w:rPr>
             </w:pPr>
             <w:r>
               <w:rPr>
@@ -833,9 +736,6 @@
           <w:p>
             <w:pPr>
               <w:jc w:val="center"/>
-              <w:rPr>
-                <w:rFonts w:hint="eastAsia"/>
-              </w:rPr>
             </w:pPr>
             <w:r>
               <w:rPr>
@@ -861,9 +761,6 @@
           <w:p>
             <w:pPr>
               <w:jc w:val="center"/>
-              <w:rPr>
-                <w:rFonts w:hint="eastAsia"/>
-              </w:rPr>
             </w:pPr>
             <w:r>
               <w:rPr>
@@ -894,9 +791,6 @@
           <w:p>
             <w:pPr>
               <w:jc w:val="center"/>
-              <w:rPr>
-                <w:rFonts w:hint="eastAsia"/>
-              </w:rPr>
             </w:pPr>
             <w:r>
               <w:rPr>
@@ -922,9 +816,6 @@
           <w:p>
             <w:pPr>
               <w:jc w:val="center"/>
-              <w:rPr>
-                <w:rFonts w:hint="eastAsia"/>
-              </w:rPr>
             </w:pPr>
             <w:r>
               <w:rPr>
@@ -955,9 +846,6 @@
           <w:p>
             <w:pPr>
               <w:jc w:val="center"/>
-              <w:rPr>
-                <w:rFonts w:hint="eastAsia"/>
-              </w:rPr>
             </w:pPr>
             <w:r>
               <w:rPr>
@@ -979,23 +867,11 @@
             </w:tcBorders>
             <w:shd w:val="clear" w:color="auto" w:fill="0B1D16"/>
           </w:tcPr>
-          <w:p>
-            <w:pPr>
-              <w:rPr>
-                <w:rFonts w:hint="eastAsia"/>
-              </w:rPr>
-            </w:pPr>
-          </w:p>
+          <w:p/>
         </w:tc>
       </w:tr>
     </w:tbl>
-    <w:p>
-      <w:pPr>
-        <w:rPr>
-          <w:rFonts w:hint="eastAsia"/>
-        </w:rPr>
-      </w:pPr>
-    </w:p>
+    <w:p/>
     <w:tbl>
       <w:tblPr>
         <w:tblW w:w="0" w:type="auto"/>
@@ -1024,9 +900,6 @@
           <w:p>
             <w:pPr>
               <w:spacing w:after="0"/>
-              <w:rPr>
-                <w:rFonts w:hint="eastAsia"/>
-              </w:rPr>
             </w:pPr>
             <w:r>
               <w:rPr>
@@ -1063,9 +936,6 @@
           <w:p>
             <w:pPr>
               <w:spacing w:after="0"/>
-              <w:rPr>
-                <w:rFonts w:hint="eastAsia"/>
-              </w:rPr>
             </w:pPr>
             <w:r>
               <w:rPr>
@@ -1080,9 +950,6 @@
     <w:p>
       <w:pPr>
         <w:spacing w:after="20"/>
-        <w:rPr>
-          <w:rFonts w:hint="eastAsia"/>
-        </w:rPr>
       </w:pPr>
     </w:p>
     <w:p>
@@ -1090,9 +957,6 @@
         <w:pStyle w:val="JungleBody"/>
         <w:spacing w:after="60"/>
         <w:ind w:left="259" w:hanging="173"/>
-        <w:rPr>
-          <w:rFonts w:hint="eastAsia"/>
-        </w:rPr>
       </w:pPr>
       <w:r>
         <w:rPr>
@@ -1106,9 +970,6 @@
         <w:pStyle w:val="JungleBody"/>
         <w:spacing w:after="60"/>
         <w:ind w:left="259" w:hanging="173"/>
-        <w:rPr>
-          <w:rFonts w:hint="eastAsia"/>
-        </w:rPr>
       </w:pPr>
       <w:r>
         <w:rPr>
@@ -1122,9 +983,6 @@
         <w:pStyle w:val="JungleBody"/>
         <w:spacing w:after="60"/>
         <w:ind w:left="259" w:hanging="173"/>
-        <w:rPr>
-          <w:rFonts w:hint="eastAsia"/>
-        </w:rPr>
       </w:pPr>
       <w:r>
         <w:rPr>
@@ -1138,9 +996,6 @@
         <w:pStyle w:val="JungleBody"/>
         <w:spacing w:after="60"/>
         <w:ind w:left="259" w:hanging="173"/>
-        <w:rPr>
-          <w:rFonts w:hint="eastAsia"/>
-        </w:rPr>
       </w:pPr>
       <w:r>
         <w:rPr>
@@ -1154,9 +1009,6 @@
         <w:pStyle w:val="JungleBody"/>
         <w:spacing w:after="60"/>
         <w:ind w:left="259" w:hanging="173"/>
-        <w:rPr>
-          <w:rFonts w:hint="eastAsia"/>
-        </w:rPr>
       </w:pPr>
       <w:r>
         <w:rPr>
@@ -1170,9 +1022,6 @@
         <w:pStyle w:val="JungleBody"/>
         <w:spacing w:after="60"/>
         <w:ind w:left="259" w:hanging="173"/>
-        <w:rPr>
-          <w:rFonts w:hint="eastAsia"/>
-        </w:rPr>
       </w:pPr>
       <w:r>
         <w:rPr>
@@ -1186,9 +1035,6 @@
         <w:pStyle w:val="JungleBody"/>
         <w:spacing w:after="60"/>
         <w:ind w:left="259" w:hanging="173"/>
-        <w:rPr>
-          <w:rFonts w:hint="eastAsia"/>
-        </w:rPr>
       </w:pPr>
       <w:r>
         <w:rPr>
@@ -1225,9 +1071,6 @@
           <w:p>
             <w:pPr>
               <w:spacing w:after="0"/>
-              <w:rPr>
-                <w:rFonts w:hint="eastAsia"/>
-              </w:rPr>
             </w:pPr>
             <w:r>
               <w:rPr>
@@ -1264,9 +1107,6 @@
           <w:p>
             <w:pPr>
               <w:spacing w:after="0"/>
-              <w:rPr>
-                <w:rFonts w:hint="eastAsia"/>
-              </w:rPr>
             </w:pPr>
             <w:r>
               <w:rPr>
@@ -1281,9 +1121,6 @@
     <w:p>
       <w:pPr>
         <w:spacing w:after="20"/>
-        <w:rPr>
-          <w:rFonts w:hint="eastAsia"/>
-        </w:rPr>
       </w:pPr>
     </w:p>
     <w:p>
@@ -1291,9 +1128,6 @@
         <w:pStyle w:val="JungleBody"/>
         <w:spacing w:after="60"/>
         <w:ind w:left="259" w:hanging="173"/>
-        <w:rPr>
-          <w:rFonts w:hint="eastAsia"/>
-        </w:rPr>
       </w:pPr>
       <w:r>
         <w:rPr>
@@ -1307,9 +1141,6 @@
         <w:pStyle w:val="JungleBody"/>
         <w:spacing w:after="60"/>
         <w:ind w:left="259" w:hanging="173"/>
-        <w:rPr>
-          <w:rFonts w:hint="eastAsia"/>
-        </w:rPr>
       </w:pPr>
       <w:r>
         <w:rPr>
@@ -1323,9 +1154,6 @@
         <w:pStyle w:val="JungleBody"/>
         <w:spacing w:after="60"/>
         <w:ind w:left="259" w:hanging="173"/>
-        <w:rPr>
-          <w:rFonts w:hint="eastAsia"/>
-        </w:rPr>
       </w:pPr>
       <w:r>
         <w:rPr>
@@ -1339,9 +1167,6 @@
         <w:pStyle w:val="JungleBody"/>
         <w:spacing w:after="60"/>
         <w:ind w:left="259" w:hanging="173"/>
-        <w:rPr>
-          <w:rFonts w:hint="eastAsia"/>
-        </w:rPr>
       </w:pPr>
       <w:r>
         <w:rPr>
@@ -1355,9 +1180,6 @@
         <w:pStyle w:val="JungleBody"/>
         <w:spacing w:after="60"/>
         <w:ind w:left="259" w:hanging="173"/>
-        <w:rPr>
-          <w:rFonts w:hint="eastAsia"/>
-        </w:rPr>
       </w:pPr>
       <w:r>
         <w:rPr>
@@ -1371,9 +1193,6 @@
         <w:pStyle w:val="JungleBody"/>
         <w:spacing w:after="60"/>
         <w:ind w:left="259" w:hanging="173"/>
-        <w:rPr>
-          <w:rFonts w:hint="eastAsia"/>
-        </w:rPr>
       </w:pPr>
       <w:r>
         <w:rPr>
@@ -1385,9 +1204,6 @@
     <w:p>
       <w:pPr>
         <w:jc w:val="center"/>
-        <w:rPr>
-          <w:rFonts w:hint="eastAsia"/>
-        </w:rPr>
       </w:pPr>
       <w:r>
         <w:rPr>
@@ -1425,9 +1241,6 @@
           <w:p>
             <w:pPr>
               <w:spacing w:after="0"/>
-              <w:rPr>
-                <w:rFonts w:hint="eastAsia"/>
-              </w:rPr>
             </w:pPr>
             <w:r>
               <w:rPr>
@@ -1464,9 +1277,6 @@
           <w:p>
             <w:pPr>
               <w:spacing w:after="0"/>
-              <w:rPr>
-                <w:rFonts w:hint="eastAsia"/>
-              </w:rPr>
             </w:pPr>
             <w:r>
               <w:rPr>
@@ -1481,9 +1291,6 @@
     <w:p>
       <w:pPr>
         <w:spacing w:after="20"/>
-        <w:rPr>
-          <w:rFonts w:hint="eastAsia"/>
-        </w:rPr>
       </w:pPr>
     </w:p>
     <w:p>
@@ -1491,9 +1298,6 @@
         <w:pStyle w:val="JungleBody"/>
         <w:spacing w:after="60"/>
         <w:ind w:left="259" w:hanging="173"/>
-        <w:rPr>
-          <w:rFonts w:hint="eastAsia"/>
-        </w:rPr>
       </w:pPr>
       <w:r>
         <w:rPr>
@@ -1507,9 +1311,6 @@
         <w:pStyle w:val="JungleBody"/>
         <w:spacing w:after="60"/>
         <w:ind w:left="259" w:hanging="173"/>
-        <w:rPr>
-          <w:rFonts w:hint="eastAsia"/>
-        </w:rPr>
       </w:pPr>
       <w:r>
         <w:rPr>
@@ -1523,9 +1324,6 @@
         <w:pStyle w:val="JungleBody"/>
         <w:spacing w:after="60"/>
         <w:ind w:left="259" w:hanging="173"/>
-        <w:rPr>
-          <w:rFonts w:hint="eastAsia"/>
-        </w:rPr>
       </w:pPr>
       <w:r>
         <w:rPr>
@@ -1539,9 +1337,6 @@
         <w:pStyle w:val="JungleBody"/>
         <w:spacing w:after="60"/>
         <w:ind w:left="259" w:hanging="173"/>
-        <w:rPr>
-          <w:rFonts w:hint="eastAsia"/>
-        </w:rPr>
       </w:pPr>
       <w:r>
         <w:rPr>
@@ -1578,9 +1373,6 @@
           <w:p>
             <w:pPr>
               <w:spacing w:after="0"/>
-              <w:rPr>
-                <w:rFonts w:hint="eastAsia"/>
-              </w:rPr>
             </w:pPr>
             <w:r>
               <w:rPr>
@@ -1618,9 +1410,6 @@
           <w:p>
             <w:pPr>
               <w:spacing w:after="0"/>
-              <w:rPr>
-                <w:rFonts w:hint="eastAsia"/>
-              </w:rPr>
             </w:pPr>
             <w:r>
               <w:rPr>
@@ -1635,9 +1424,6 @@
     <w:p>
       <w:pPr>
         <w:spacing w:after="20"/>
-        <w:rPr>
-          <w:rFonts w:hint="eastAsia"/>
-        </w:rPr>
       </w:pPr>
     </w:p>
     <w:p>
@@ -1645,9 +1431,6 @@
         <w:pStyle w:val="JungleBody"/>
         <w:spacing w:after="60"/>
         <w:ind w:left="259" w:hanging="173"/>
-        <w:rPr>
-          <w:rFonts w:hint="eastAsia"/>
-        </w:rPr>
       </w:pPr>
       <w:r>
         <w:rPr>
@@ -1661,9 +1444,6 @@
         <w:pStyle w:val="JungleBody"/>
         <w:spacing w:after="60"/>
         <w:ind w:left="259" w:hanging="173"/>
-        <w:rPr>
-          <w:rFonts w:hint="eastAsia"/>
-        </w:rPr>
       </w:pPr>
       <w:r>
         <w:rPr>
@@ -1677,9 +1457,6 @@
         <w:pStyle w:val="JungleBody"/>
         <w:spacing w:after="60"/>
         <w:ind w:left="259" w:hanging="173"/>
-        <w:rPr>
-          <w:rFonts w:hint="eastAsia"/>
-        </w:rPr>
       </w:pPr>
       <w:r>
         <w:rPr>
@@ -1693,9 +1470,6 @@
         <w:pStyle w:val="JungleBody"/>
         <w:spacing w:after="60"/>
         <w:ind w:left="259" w:hanging="173"/>
-        <w:rPr>
-          <w:rFonts w:hint="eastAsia"/>
-        </w:rPr>
       </w:pPr>
       <w:r>
         <w:rPr>
@@ -1732,9 +1506,6 @@
           <w:p>
             <w:pPr>
               <w:spacing w:after="0"/>
-              <w:rPr>
-                <w:rFonts w:hint="eastAsia"/>
-              </w:rPr>
             </w:pPr>
             <w:r>
               <w:rPr>
@@ -1771,9 +1542,6 @@
           <w:p>
             <w:pPr>
               <w:spacing w:after="0"/>
-              <w:rPr>
-                <w:rFonts w:hint="eastAsia"/>
-              </w:rPr>
             </w:pPr>
             <w:r>
               <w:rPr>
@@ -1788,9 +1556,6 @@
     <w:p>
       <w:pPr>
         <w:spacing w:after="20"/>
-        <w:rPr>
-          <w:rFonts w:hint="eastAsia"/>
-        </w:rPr>
       </w:pPr>
     </w:p>
     <w:p>
@@ -1798,9 +1563,6 @@
         <w:pStyle w:val="JungleBody"/>
         <w:spacing w:after="60"/>
         <w:ind w:left="259" w:hanging="173"/>
-        <w:rPr>
-          <w:rFonts w:hint="eastAsia"/>
-        </w:rPr>
       </w:pPr>
       <w:r>
         <w:rPr>
@@ -1814,9 +1576,6 @@
         <w:pStyle w:val="JungleBody"/>
         <w:spacing w:after="60"/>
         <w:ind w:left="259" w:hanging="173"/>
-        <w:rPr>
-          <w:rFonts w:hint="eastAsia"/>
-        </w:rPr>
       </w:pPr>
       <w:r>
         <w:rPr>
@@ -1830,9 +1589,6 @@
         <w:pStyle w:val="JungleBody"/>
         <w:spacing w:after="60"/>
         <w:ind w:left="259" w:hanging="173"/>
-        <w:rPr>
-          <w:rFonts w:hint="eastAsia"/>
-        </w:rPr>
       </w:pPr>
       <w:r>
         <w:rPr>
@@ -1846,9 +1602,6 @@
         <w:pStyle w:val="JungleBody"/>
         <w:spacing w:after="60"/>
         <w:ind w:left="259" w:hanging="173"/>
-        <w:rPr>
-          <w:rFonts w:hint="eastAsia"/>
-        </w:rPr>
       </w:pPr>
       <w:r>
         <w:rPr>
@@ -1862,9 +1615,6 @@
         <w:pStyle w:val="JungleBody"/>
         <w:spacing w:after="60"/>
         <w:ind w:left="259" w:hanging="173"/>
-        <w:rPr>
-          <w:rFonts w:hint="eastAsia"/>
-        </w:rPr>
       </w:pPr>
       <w:r>
         <w:rPr>
@@ -1901,9 +1651,6 @@
           <w:p>
             <w:pPr>
               <w:spacing w:after="0"/>
-              <w:rPr>
-                <w:rFonts w:hint="eastAsia"/>
-              </w:rPr>
             </w:pPr>
             <w:r>
               <w:rPr>
@@ -1940,9 +1687,6 @@
           <w:p>
             <w:pPr>
               <w:spacing w:after="0"/>
-              <w:rPr>
-                <w:rFonts w:hint="eastAsia"/>
-              </w:rPr>
             </w:pPr>
             <w:r>
               <w:rPr>
@@ -1957,9 +1701,6 @@
     <w:p>
       <w:pPr>
         <w:spacing w:after="20"/>
-        <w:rPr>
-          <w:rFonts w:hint="eastAsia"/>
-        </w:rPr>
       </w:pPr>
     </w:p>
     <w:p>
@@ -1967,9 +1708,6 @@
         <w:pStyle w:val="JungleBody"/>
         <w:spacing w:after="60"/>
         <w:ind w:left="259" w:hanging="173"/>
-        <w:rPr>
-          <w:rFonts w:hint="eastAsia"/>
-        </w:rPr>
       </w:pPr>
       <w:r>
         <w:rPr>
@@ -1983,9 +1721,6 @@
         <w:pStyle w:val="JungleBody"/>
         <w:spacing w:after="60"/>
         <w:ind w:left="259" w:hanging="173"/>
-        <w:rPr>
-          <w:rFonts w:hint="eastAsia"/>
-        </w:rPr>
       </w:pPr>
       <w:r>
         <w:rPr>
@@ -1999,9 +1734,6 @@
         <w:pStyle w:val="JungleBody"/>
         <w:spacing w:after="60"/>
         <w:ind w:left="259" w:hanging="173"/>
-        <w:rPr>
-          <w:rFonts w:hint="eastAsia"/>
-        </w:rPr>
       </w:pPr>
       <w:r>
         <w:rPr>
@@ -2015,9 +1747,6 @@
         <w:pStyle w:val="JungleBody"/>
         <w:spacing w:after="60"/>
         <w:ind w:left="259" w:hanging="173"/>
-        <w:rPr>
-          <w:rFonts w:hint="eastAsia"/>
-        </w:rPr>
       </w:pPr>
       <w:r>
         <w:rPr>
@@ -2031,9 +1760,6 @@
         <w:pStyle w:val="JungleBody"/>
         <w:spacing w:after="60"/>
         <w:ind w:left="259" w:hanging="173"/>
-        <w:rPr>
-          <w:rFonts w:hint="eastAsia"/>
-        </w:rPr>
       </w:pPr>
       <w:r>
         <w:rPr>
@@ -2070,9 +1796,6 @@
           <w:p>
             <w:pPr>
               <w:spacing w:after="0"/>
-              <w:rPr>
-                <w:rFonts w:hint="eastAsia"/>
-              </w:rPr>
             </w:pPr>
             <w:r>
               <w:rPr>
@@ -2109,9 +1832,6 @@
           <w:p>
             <w:pPr>
               <w:spacing w:after="0"/>
-              <w:rPr>
-                <w:rFonts w:hint="eastAsia"/>
-              </w:rPr>
             </w:pPr>
             <w:r>
               <w:rPr>
@@ -2126,9 +1846,6 @@
     <w:p>
       <w:pPr>
         <w:spacing w:after="20"/>
-        <w:rPr>
-          <w:rFonts w:hint="eastAsia"/>
-        </w:rPr>
       </w:pPr>
     </w:p>
     <w:p>
@@ -2136,9 +1853,6 @@
         <w:pStyle w:val="JungleBody"/>
         <w:spacing w:after="60"/>
         <w:ind w:left="259" w:hanging="173"/>
-        <w:rPr>
-          <w:rFonts w:hint="eastAsia"/>
-        </w:rPr>
       </w:pPr>
       <w:r>
         <w:rPr>
@@ -2152,9 +1866,6 @@
         <w:pStyle w:val="JungleBody"/>
         <w:spacing w:after="60"/>
         <w:ind w:left="259" w:hanging="173"/>
-        <w:rPr>
-          <w:rFonts w:hint="eastAsia"/>
-        </w:rPr>
       </w:pPr>
       <w:r>
         <w:rPr>
@@ -2168,9 +1879,6 @@
         <w:pStyle w:val="JungleBody"/>
         <w:spacing w:after="60"/>
         <w:ind w:left="259" w:hanging="173"/>
-        <w:rPr>
-          <w:rFonts w:hint="eastAsia"/>
-        </w:rPr>
       </w:pPr>
       <w:r>
         <w:rPr>
@@ -2184,9 +1892,6 @@
         <w:pStyle w:val="JungleBody"/>
         <w:spacing w:after="60"/>
         <w:ind w:left="259" w:hanging="173"/>
-        <w:rPr>
-          <w:rFonts w:hint="eastAsia"/>
-        </w:rPr>
       </w:pPr>
       <w:r>
         <w:rPr>
@@ -2200,9 +1905,6 @@
         <w:pStyle w:val="JungleBody"/>
         <w:spacing w:after="60"/>
         <w:ind w:left="259" w:hanging="173"/>
-        <w:rPr>
-          <w:rFonts w:hint="eastAsia"/>
-        </w:rPr>
       </w:pPr>
       <w:r>
         <w:rPr>
@@ -2216,9 +1918,6 @@
         <w:pStyle w:val="JungleBody"/>
         <w:spacing w:after="60"/>
         <w:ind w:left="259" w:hanging="173"/>
-        <w:rPr>
-          <w:rFonts w:hint="eastAsia"/>
-        </w:rPr>
       </w:pPr>
       <w:r>
         <w:rPr>
@@ -2255,9 +1954,6 @@
           <w:p>
             <w:pPr>
               <w:spacing w:after="0"/>
-              <w:rPr>
-                <w:rFonts w:hint="eastAsia"/>
-              </w:rPr>
             </w:pPr>
             <w:r>
               <w:rPr>
@@ -2294,9 +1990,6 @@
           <w:p>
             <w:pPr>
               <w:spacing w:after="0"/>
-              <w:rPr>
-                <w:rFonts w:hint="eastAsia"/>
-              </w:rPr>
             </w:pPr>
             <w:r>
               <w:rPr>
@@ -2311,9 +2004,6 @@
     <w:p>
       <w:pPr>
         <w:spacing w:after="20"/>
-        <w:rPr>
-          <w:rFonts w:hint="eastAsia"/>
-        </w:rPr>
       </w:pPr>
     </w:p>
     <w:p>
@@ -2321,9 +2011,6 @@
         <w:pStyle w:val="JungleBody"/>
         <w:spacing w:after="60"/>
         <w:ind w:left="259" w:hanging="173"/>
-        <w:rPr>
-          <w:rFonts w:hint="eastAsia"/>
-        </w:rPr>
       </w:pPr>
       <w:r>
         <w:rPr>
@@ -2338,9 +2025,6 @@
         <w:pStyle w:val="JungleBody"/>
         <w:spacing w:after="60"/>
         <w:ind w:left="259" w:hanging="173"/>
-        <w:rPr>
-          <w:rFonts w:hint="eastAsia"/>
-        </w:rPr>
       </w:pPr>
       <w:r>
         <w:rPr>
@@ -2354,9 +2038,6 @@
         <w:pStyle w:val="JungleBody"/>
         <w:spacing w:after="60"/>
         <w:ind w:left="259" w:hanging="173"/>
-        <w:rPr>
-          <w:rFonts w:hint="eastAsia"/>
-        </w:rPr>
       </w:pPr>
       <w:r>
         <w:rPr>
@@ -2370,9 +2051,6 @@
         <w:pStyle w:val="JungleBody"/>
         <w:spacing w:after="60"/>
         <w:ind w:left="259" w:hanging="173"/>
-        <w:rPr>
-          <w:rFonts w:hint="eastAsia"/>
-        </w:rPr>
       </w:pPr>
       <w:r>
         <w:rPr>
@@ -2386,9 +2064,6 @@
         <w:pStyle w:val="JungleBody"/>
         <w:spacing w:after="60"/>
         <w:ind w:left="259" w:hanging="173"/>
-        <w:rPr>
-          <w:rFonts w:hint="eastAsia"/>
-        </w:rPr>
       </w:pPr>
       <w:r>
         <w:rPr>
@@ -2402,9 +2077,6 @@
         <w:pStyle w:val="JungleBody"/>
         <w:spacing w:after="60"/>
         <w:ind w:left="259" w:hanging="173"/>
-        <w:rPr>
-          <w:rFonts w:hint="eastAsia"/>
-        </w:rPr>
       </w:pPr>
       <w:r>
         <w:rPr>
@@ -2418,9 +2090,6 @@
         <w:pStyle w:val="JungleBody"/>
         <w:spacing w:after="60"/>
         <w:ind w:left="259" w:hanging="173"/>
-        <w:rPr>
-          <w:rFonts w:hint="eastAsia"/>
-        </w:rPr>
       </w:pPr>
       <w:r>
         <w:rPr>
@@ -2457,9 +2126,6 @@
           <w:p>
             <w:pPr>
               <w:spacing w:after="0"/>
-              <w:rPr>
-                <w:rFonts w:hint="eastAsia"/>
-              </w:rPr>
             </w:pPr>
             <w:r>
               <w:rPr>
@@ -2496,9 +2162,6 @@
           <w:p>
             <w:pPr>
               <w:spacing w:after="0"/>
-              <w:rPr>
-                <w:rFonts w:hint="eastAsia"/>
-              </w:rPr>
             </w:pPr>
             <w:r>
               <w:rPr>
@@ -2513,9 +2176,6 @@
     <w:p>
       <w:pPr>
         <w:spacing w:after="20"/>
-        <w:rPr>
-          <w:rFonts w:hint="eastAsia"/>
-        </w:rPr>
       </w:pPr>
     </w:p>
     <w:p>
@@ -2523,9 +2183,6 @@
         <w:pStyle w:val="JungleBody"/>
         <w:spacing w:after="60"/>
         <w:ind w:left="259" w:hanging="173"/>
-        <w:rPr>
-          <w:rFonts w:hint="eastAsia"/>
-        </w:rPr>
       </w:pPr>
       <w:r>
         <w:rPr>
@@ -2539,9 +2196,6 @@
         <w:pStyle w:val="JungleBody"/>
         <w:spacing w:after="60"/>
         <w:ind w:left="259" w:hanging="173"/>
-        <w:rPr>
-          <w:rFonts w:hint="eastAsia"/>
-        </w:rPr>
       </w:pPr>
       <w:r>
         <w:rPr>
@@ -2555,9 +2209,6 @@
         <w:pStyle w:val="JungleBody"/>
         <w:spacing w:after="60"/>
         <w:ind w:left="259" w:hanging="173"/>
-        <w:rPr>
-          <w:rFonts w:hint="eastAsia"/>
-        </w:rPr>
       </w:pPr>
       <w:r>
         <w:rPr>
@@ -2571,9 +2222,6 @@
         <w:pStyle w:val="JungleBody"/>
         <w:spacing w:after="60"/>
         <w:ind w:left="259" w:hanging="173"/>
-        <w:rPr>
-          <w:rFonts w:hint="eastAsia"/>
-        </w:rPr>
       </w:pPr>
       <w:r>
         <w:rPr>
@@ -2587,9 +2235,6 @@
         <w:pStyle w:val="JungleBody"/>
         <w:spacing w:after="60"/>
         <w:ind w:left="259" w:hanging="173"/>
-        <w:rPr>
-          <w:rFonts w:hint="eastAsia"/>
-        </w:rPr>
       </w:pPr>
       <w:r>
         <w:rPr>
@@ -2626,9 +2271,6 @@
           <w:p>
             <w:pPr>
               <w:spacing w:after="0"/>
-              <w:rPr>
-                <w:rFonts w:hint="eastAsia"/>
-              </w:rPr>
             </w:pPr>
             <w:r>
               <w:rPr>
@@ -2665,9 +2307,6 @@
           <w:p>
             <w:pPr>
               <w:spacing w:after="0"/>
-              <w:rPr>
-                <w:rFonts w:hint="eastAsia"/>
-              </w:rPr>
             </w:pPr>
             <w:r>
               <w:rPr>
@@ -2682,9 +2321,6 @@
     <w:p>
       <w:pPr>
         <w:spacing w:after="20"/>
-        <w:rPr>
-          <w:rFonts w:hint="eastAsia"/>
-        </w:rPr>
       </w:pPr>
     </w:p>
     <w:p>
@@ -2692,9 +2328,6 @@
         <w:pStyle w:val="JungleBody"/>
         <w:spacing w:after="60"/>
         <w:ind w:left="259" w:hanging="173"/>
-        <w:rPr>
-          <w:rFonts w:hint="eastAsia"/>
-        </w:rPr>
       </w:pPr>
       <w:r>
         <w:rPr>
@@ -2708,9 +2341,6 @@
         <w:pStyle w:val="JungleBody"/>
         <w:spacing w:after="60"/>
         <w:ind w:left="259" w:hanging="173"/>
-        <w:rPr>
-          <w:rFonts w:hint="eastAsia"/>
-        </w:rPr>
       </w:pPr>
       <w:r>
         <w:rPr>
@@ -2724,9 +2354,6 @@
         <w:pStyle w:val="JungleBody"/>
         <w:spacing w:after="60"/>
         <w:ind w:left="259" w:hanging="173"/>
-        <w:rPr>
-          <w:rFonts w:hint="eastAsia"/>
-        </w:rPr>
       </w:pPr>
       <w:r>
         <w:rPr>
@@ -2740,9 +2367,6 @@
         <w:pStyle w:val="JungleBody"/>
         <w:spacing w:after="60"/>
         <w:ind w:left="259" w:hanging="173"/>
-        <w:rPr>
-          <w:rFonts w:hint="eastAsia"/>
-        </w:rPr>
       </w:pPr>
       <w:r>
         <w:rPr>
@@ -2756,9 +2380,6 @@
         <w:pStyle w:val="JungleBody"/>
         <w:spacing w:after="60"/>
         <w:ind w:left="259" w:hanging="173"/>
-        <w:rPr>
-          <w:rFonts w:hint="eastAsia"/>
-        </w:rPr>
       </w:pPr>
       <w:r>
         <w:rPr>
@@ -2772,9 +2393,6 @@
         <w:pStyle w:val="JungleBody"/>
         <w:spacing w:after="60"/>
         <w:ind w:left="259" w:hanging="173"/>
-        <w:rPr>
-          <w:rFonts w:hint="eastAsia"/>
-        </w:rPr>
       </w:pPr>
       <w:r>
         <w:rPr>
@@ -2788,9 +2406,6 @@
         <w:pStyle w:val="JungleBody"/>
         <w:spacing w:after="60"/>
         <w:ind w:left="259" w:hanging="173"/>
-        <w:rPr>
-          <w:rFonts w:hint="eastAsia"/>
-        </w:rPr>
       </w:pPr>
       <w:r>
         <w:rPr>
@@ -2804,9 +2419,6 @@
         <w:pStyle w:val="JungleBody"/>
         <w:spacing w:after="60"/>
         <w:ind w:left="259" w:hanging="173"/>
-        <w:rPr>
-          <w:rFonts w:hint="eastAsia"/>
-        </w:rPr>
       </w:pPr>
       <w:r>
         <w:rPr>
@@ -2843,9 +2455,6 @@
           <w:p>
             <w:pPr>
               <w:spacing w:after="0"/>
-              <w:rPr>
-                <w:rFonts w:hint="eastAsia"/>
-              </w:rPr>
             </w:pPr>
             <w:r>
               <w:rPr>
@@ -2882,9 +2491,6 @@
           <w:p>
             <w:pPr>
               <w:spacing w:after="0"/>
-              <w:rPr>
-                <w:rFonts w:hint="eastAsia"/>
-              </w:rPr>
             </w:pPr>
             <w:r>
               <w:rPr>
@@ -2899,9 +2505,6 @@
     <w:p>
       <w:pPr>
         <w:spacing w:after="20"/>
-        <w:rPr>
-          <w:rFonts w:hint="eastAsia"/>
-        </w:rPr>
       </w:pPr>
     </w:p>
     <w:p>
@@ -2909,9 +2512,6 @@
         <w:pStyle w:val="JungleBody"/>
         <w:spacing w:after="60"/>
         <w:ind w:left="259" w:hanging="173"/>
-        <w:rPr>
-          <w:rFonts w:hint="eastAsia"/>
-        </w:rPr>
       </w:pPr>
       <w:r>
         <w:rPr>
@@ -2925,9 +2525,6 @@
         <w:pStyle w:val="JungleBody"/>
         <w:spacing w:after="60"/>
         <w:ind w:left="259" w:hanging="173"/>
-        <w:rPr>
-          <w:rFonts w:hint="eastAsia"/>
-        </w:rPr>
       </w:pPr>
       <w:r>
         <w:rPr>
@@ -2941,9 +2538,6 @@
         <w:pStyle w:val="JungleBody"/>
         <w:spacing w:after="60"/>
         <w:ind w:left="259" w:hanging="173"/>
-        <w:rPr>
-          <w:rFonts w:hint="eastAsia"/>
-        </w:rPr>
       </w:pPr>
       <w:r>
         <w:rPr>
@@ -2957,9 +2551,6 @@
         <w:pStyle w:val="JungleBody"/>
         <w:spacing w:after="60"/>
         <w:ind w:left="259" w:hanging="173"/>
-        <w:rPr>
-          <w:rFonts w:hint="eastAsia"/>
-        </w:rPr>
       </w:pPr>
       <w:r>
         <w:rPr>
@@ -2973,9 +2564,6 @@
         <w:pStyle w:val="JungleBody"/>
         <w:spacing w:after="60"/>
         <w:ind w:left="259" w:hanging="173"/>
-        <w:rPr>
-          <w:rFonts w:hint="eastAsia"/>
-        </w:rPr>
       </w:pPr>
       <w:r>
         <w:rPr>
@@ -2989,9 +2577,6 @@
         <w:pStyle w:val="JungleBody"/>
         <w:spacing w:after="60"/>
         <w:ind w:left="259" w:hanging="173"/>
-        <w:rPr>
-          <w:rFonts w:hint="eastAsia"/>
-        </w:rPr>
       </w:pPr>
       <w:r>
         <w:rPr>
@@ -3006,9 +2591,6 @@
         <w:pStyle w:val="JungleBody"/>
         <w:spacing w:after="60"/>
         <w:ind w:left="259" w:hanging="173"/>
-        <w:rPr>
-          <w:rFonts w:hint="eastAsia"/>
-        </w:rPr>
       </w:pPr>
       <w:r>
         <w:rPr>
@@ -3022,9 +2604,6 @@
         <w:pStyle w:val="JungleBody"/>
         <w:spacing w:after="60"/>
         <w:ind w:left="259" w:hanging="173"/>
-        <w:rPr>
-          <w:rFonts w:hint="eastAsia"/>
-        </w:rPr>
       </w:pPr>
       <w:r>
         <w:rPr>
@@ -3038,9 +2617,6 @@
         <w:pStyle w:val="JungleBody"/>
         <w:spacing w:after="60"/>
         <w:ind w:left="259" w:hanging="173"/>
-        <w:rPr>
-          <w:rFonts w:hint="eastAsia"/>
-        </w:rPr>
       </w:pPr>
       <w:r>
         <w:rPr>
@@ -3077,9 +2653,6 @@
           <w:p>
             <w:pPr>
               <w:spacing w:after="0"/>
-              <w:rPr>
-                <w:rFonts w:hint="eastAsia"/>
-              </w:rPr>
             </w:pPr>
             <w:r>
               <w:rPr>
@@ -3116,9 +2689,6 @@
           <w:p>
             <w:pPr>
               <w:spacing w:after="0"/>
-              <w:rPr>
-                <w:rFonts w:hint="eastAsia"/>
-              </w:rPr>
             </w:pPr>
             <w:r>
               <w:rPr>
@@ -3133,9 +2703,6 @@
     <w:p>
       <w:pPr>
         <w:spacing w:after="20"/>
-        <w:rPr>
-          <w:rFonts w:hint="eastAsia"/>
-        </w:rPr>
       </w:pPr>
     </w:p>
     <w:p>
@@ -3143,9 +2710,6 @@
         <w:pStyle w:val="JungleBody"/>
         <w:spacing w:after="60"/>
         <w:ind w:left="259" w:hanging="173"/>
-        <w:rPr>
-          <w:rFonts w:hint="eastAsia"/>
-        </w:rPr>
       </w:pPr>
       <w:r>
         <w:rPr>
@@ -3159,9 +2723,6 @@
         <w:pStyle w:val="JungleBody"/>
         <w:spacing w:after="60"/>
         <w:ind w:left="259" w:hanging="173"/>
-        <w:rPr>
-          <w:rFonts w:hint="eastAsia"/>
-        </w:rPr>
       </w:pPr>
       <w:r>
         <w:rPr>
@@ -3175,9 +2736,6 @@
         <w:pStyle w:val="JungleBody"/>
         <w:spacing w:after="60"/>
         <w:ind w:left="259" w:hanging="173"/>
-        <w:rPr>
-          <w:rFonts w:hint="eastAsia"/>
-        </w:rPr>
       </w:pPr>
       <w:r>
         <w:rPr>
@@ -3191,9 +2749,6 @@
         <w:pStyle w:val="JungleBody"/>
         <w:spacing w:after="60"/>
         <w:ind w:left="259" w:hanging="173"/>
-        <w:rPr>
-          <w:rFonts w:hint="eastAsia"/>
-        </w:rPr>
       </w:pPr>
       <w:r>
         <w:rPr>
@@ -3207,9 +2762,6 @@
         <w:pStyle w:val="JungleBody"/>
         <w:spacing w:after="60"/>
         <w:ind w:left="259" w:hanging="173"/>
-        <w:rPr>
-          <w:rFonts w:hint="eastAsia"/>
-        </w:rPr>
       </w:pPr>
       <w:r>
         <w:rPr>
@@ -3223,9 +2775,6 @@
         <w:pStyle w:val="JungleBody"/>
         <w:spacing w:after="60"/>
         <w:ind w:left="259" w:hanging="173"/>
-        <w:rPr>
-          <w:rFonts w:hint="eastAsia"/>
-        </w:rPr>
       </w:pPr>
       <w:r>
         <w:rPr>
@@ -3239,9 +2788,6 @@
         <w:pStyle w:val="JungleBody"/>
         <w:spacing w:after="60"/>
         <w:ind w:left="259" w:hanging="173"/>
-        <w:rPr>
-          <w:rFonts w:hint="eastAsia"/>
-        </w:rPr>
       </w:pPr>
       <w:r>
         <w:rPr>
@@ -3278,9 +2824,6 @@
           <w:p>
             <w:pPr>
               <w:spacing w:after="0"/>
-              <w:rPr>
-                <w:rFonts w:hint="eastAsia"/>
-              </w:rPr>
             </w:pPr>
             <w:r>
               <w:rPr>
@@ -3317,9 +2860,6 @@
           <w:p>
             <w:pPr>
               <w:spacing w:after="0"/>
-              <w:rPr>
-                <w:rFonts w:hint="eastAsia"/>
-              </w:rPr>
             </w:pPr>
             <w:r>
               <w:rPr>
@@ -3334,9 +2874,6 @@
     <w:p>
       <w:pPr>
         <w:spacing w:after="20"/>
-        <w:rPr>
-          <w:rFonts w:hint="eastAsia"/>
-        </w:rPr>
       </w:pPr>
     </w:p>
     <w:p>
@@ -3345,7 +2882,7 @@
         <w:spacing w:after="60"/>
         <w:ind w:left="259" w:hanging="173"/>
         <w:rPr>
-          <w:rFonts w:hint="eastAsia"/>
+          <w:color w:val="4E7A45"/>
         </w:rPr>
       </w:pPr>
       <w:r>
@@ -3360,9 +2897,6 @@
         <w:pStyle w:val="JungleBody"/>
         <w:spacing w:after="60"/>
         <w:ind w:left="259" w:hanging="173"/>
-        <w:rPr>
-          <w:rFonts w:hint="eastAsia"/>
-        </w:rPr>
       </w:pPr>
       <w:r>
         <w:rPr>
@@ -3376,9 +2910,6 @@
         <w:pStyle w:val="JungleBody"/>
         <w:spacing w:after="60"/>
         <w:ind w:left="259" w:hanging="173"/>
-        <w:rPr>
-          <w:rFonts w:hint="eastAsia"/>
-        </w:rPr>
       </w:pPr>
       <w:r>
         <w:rPr>
@@ -3392,9 +2923,6 @@
         <w:pStyle w:val="JungleBody"/>
         <w:spacing w:after="60"/>
         <w:ind w:left="259" w:hanging="173"/>
-        <w:rPr>
-          <w:rFonts w:hint="eastAsia"/>
-        </w:rPr>
       </w:pPr>
       <w:r>
         <w:rPr>
@@ -3409,7 +2937,7 @@
         <w:spacing w:after="60"/>
         <w:ind w:left="259" w:hanging="173"/>
         <w:rPr>
-          <w:rFonts w:hint="eastAsia"/>
+          <w:color w:val="4E7A45"/>
         </w:rPr>
       </w:pPr>
       <w:r>
@@ -3421,11 +2949,27 @@
     </w:p>
     <w:p>
       <w:pPr>
+        <w:pStyle w:val="JungleBody"/>
+        <w:spacing w:after="60"/>
+        <w:ind w:left="259" w:hanging="173"/>
+      </w:pPr>
+      <w:r>
+        <w:rPr>
+          <w:color w:val="4E7A45"/>
+        </w:rPr>
+        <w:t xml:space="preserve">Live Link: </w:t>
+      </w:r>
+      <w:r>
+        <w:rPr>
+          <w:color w:val="4E7A45"/>
+        </w:rPr>
+        <w:t>https://designx-hash.github.io/Fendom_Verse/</w:t>
+      </w:r>
+    </w:p>
+    <w:p>
+      <w:pPr>
         <w:spacing w:after="100"/>
         <w:jc w:val="center"/>
-        <w:rPr>
-          <w:rFonts w:hint="eastAsia"/>
-        </w:rPr>
       </w:pPr>
       <w:r>
         <w:rPr>
@@ -3438,9 +2982,6 @@
     <w:p>
       <w:pPr>
         <w:jc w:val="center"/>
-        <w:rPr>
-          <w:rFonts w:hint="eastAsia"/>
-        </w:rPr>
       </w:pPr>
       <w:r>
         <w:rPr>
@@ -3454,9 +2995,6 @@
     <w:p>
       <w:pPr>
         <w:jc w:val="center"/>
-        <w:rPr>
-          <w:rFonts w:hint="eastAsia"/>
-        </w:rPr>
       </w:pPr>
       <w:r>
         <w:rPr>
@@ -3469,9 +3007,6 @@
     <w:p>
       <w:pPr>
         <w:jc w:val="center"/>
-        <w:rPr>
-          <w:rFonts w:hint="eastAsia"/>
-        </w:rPr>
       </w:pPr>
       <w:r>
         <w:rPr>
@@ -3484,9 +3019,6 @@
     <w:p>
       <w:pPr>
         <w:jc w:val="center"/>
-        <w:rPr>
-          <w:rFonts w:hint="eastAsia"/>
-        </w:rPr>
       </w:pPr>
       <w:r>
         <w:rPr>
@@ -3498,9 +3030,6 @@
     <w:p>
       <w:pPr>
         <w:jc w:val="center"/>
-        <w:rPr>
-          <w:rFonts w:hint="eastAsia"/>
-        </w:rPr>
       </w:pPr>
       <w:r>
         <w:rPr>
@@ -3529,9 +3058,6 @@
     <w:p>
       <w:pPr>
         <w:spacing w:after="0" w:line="240" w:lineRule="auto"/>
-        <w:rPr>
-          <w:rFonts w:hint="eastAsia"/>
-        </w:rPr>
       </w:pPr>
       <w:r>
         <w:separator/>
@@ -3542,9 +3068,6 @@
     <w:p>
       <w:pPr>
         <w:spacing w:after="0" w:line="240" w:lineRule="auto"/>
-        <w:rPr>
-          <w:rFonts w:hint="eastAsia"/>
-        </w:rPr>
       </w:pPr>
       <w:r>
         <w:continuationSeparator/>
@@ -3560,57 +3083,13 @@
     <w:pPr>
       <w:pStyle w:val="Footer"/>
       <w:jc w:val="center"/>
-      <w:rPr>
-        <w:rFonts w:hint="eastAsia"/>
-      </w:rPr>
     </w:pPr>
-    <w:proofErr w:type="spellStart"/>
     <w:r>
       <w:rPr>
         <w:color w:val="718A78"/>
         <w:sz w:val="16"/>
       </w:rPr>
-      <w:t>FandomVerse</w:t>
-    </w:r>
-    <w:proofErr w:type="spellEnd"/>
-    <w:r>
-      <w:rPr>
-        <w:color w:val="718A78"/>
-        <w:sz w:val="16"/>
-      </w:rPr>
-      <w:t xml:space="preserve"> Project </w:t>
-    </w:r>
-    <w:proofErr w:type="gramStart"/>
-    <w:r>
-      <w:rPr>
-        <w:color w:val="718A78"/>
-        <w:sz w:val="16"/>
-      </w:rPr>
-      <w:t>Documentation  •</w:t>
-    </w:r>
-    <w:proofErr w:type="gramEnd"/>
-    <w:r>
-      <w:rPr>
-        <w:color w:val="718A78"/>
-        <w:sz w:val="16"/>
-      </w:rPr>
-      <w:t xml:space="preserve">  Jungle </w:t>
-    </w:r>
-    <w:proofErr w:type="gramStart"/>
-    <w:r>
-      <w:rPr>
-        <w:color w:val="718A78"/>
-        <w:sz w:val="16"/>
-      </w:rPr>
-      <w:t>Edition  •</w:t>
-    </w:r>
-    <w:proofErr w:type="gramEnd"/>
-    <w:r>
-      <w:rPr>
-        <w:color w:val="718A78"/>
-        <w:sz w:val="16"/>
-      </w:rPr>
-      <w:t xml:space="preserve">  Version 1.0</w:t>
+      <w:t>FandomVerse Project Documentation  •  Jungle Edition  •  Version 1.0</w:t>
     </w:r>
   </w:p>
 </w:ftr>
@@ -3622,9 +3101,6 @@
     <w:p>
       <w:pPr>
         <w:spacing w:after="0" w:line="240" w:lineRule="auto"/>
-        <w:rPr>
-          <w:rFonts w:hint="eastAsia"/>
-        </w:rPr>
       </w:pPr>
       <w:r>
         <w:separator/>
@@ -3635,9 +3111,6 @@
     <w:p>
       <w:pPr>
         <w:spacing w:after="0" w:line="240" w:lineRule="auto"/>
-        <w:rPr>
-          <w:rFonts w:hint="eastAsia"/>
-        </w:rPr>
       </w:pPr>
       <w:r>
         <w:continuationSeparator/>
@@ -3653,56 +3126,15 @@
     <w:pPr>
       <w:pStyle w:val="Header"/>
       <w:jc w:val="center"/>
-      <w:rPr>
-        <w:rFonts w:hint="eastAsia"/>
-      </w:rPr>
     </w:pPr>
-    <w:proofErr w:type="gramStart"/>
     <w:r>
       <w:rPr>
         <w:b/>
         <w:color w:val="4E7A45"/>
         <w:sz w:val="16"/>
       </w:rPr>
-      <w:t>🌿  FANDOMVERSE</w:t>
+      <w:t>🌿  FANDOMVERSE  •  JUNGLE EDITION  🌿</w:t>
     </w:r>
-    <w:proofErr w:type="gramEnd"/>
-    <w:r>
-      <w:rPr>
-        <w:b/>
-        <w:color w:val="4E7A45"/>
-        <w:sz w:val="16"/>
-      </w:rPr>
-      <w:t xml:space="preserve">  </w:t>
-    </w:r>
-    <w:proofErr w:type="gramStart"/>
-    <w:r>
-      <w:rPr>
-        <w:b/>
-        <w:color w:val="4E7A45"/>
-        <w:sz w:val="16"/>
-      </w:rPr>
-      <w:t>•  JUNGLE</w:t>
-    </w:r>
-    <w:proofErr w:type="gramEnd"/>
-    <w:r>
-      <w:rPr>
-        <w:b/>
-        <w:color w:val="4E7A45"/>
-        <w:sz w:val="16"/>
-      </w:rPr>
-      <w:t xml:space="preserve"> </w:t>
-    </w:r>
-    <w:proofErr w:type="gramStart"/>
-    <w:r>
-      <w:rPr>
-        <w:b/>
-        <w:color w:val="4E7A45"/>
-        <w:sz w:val="16"/>
-      </w:rPr>
-      <w:t>EDITION  🌿</w:t>
-    </w:r>
-    <w:proofErr w:type="gramEnd"/>
   </w:p>
 </w:hdr>
 </file>

</xml_diff>